<commit_message>
Add Step Noise Finder app and fix PyInstaller single-file build
- New step_finder.py: automated scanner that detects periodic step noise
  (4-20 Hz, configurable amplitude) across all channels in one or more
  TDD baseline files using bandpass filtering + autocorrelation
- GUI with results table (file, channel, time range, freq, amplitude,
  baseline, periodicity) and raw/filtered waveform plots
- Supports single file, multi-file pick, and folder scan modes
- Fix PyInstaller builds: redirect None stdout/stderr for windowed apps,
  add numpy.f2py and scipy hidden imports, switch to single-file onefile mode
- Add step_finder.spec for StepNoiseFinder.exe build
- Update documentation

Co-Authored-By: Claude Opus 4.6 <noreply@anthropic.com>
</commit_message>
<xml_diff>
--- a/doc/Step Noise Detection - User Guide.docx
+++ b/doc/Step Noise Detection - User Guide.docx
@@ -32,6 +32,21 @@
           <w:szCs w:val="36"/>
         </w:rPr>
         <w:t xml:space="preserve">User Guide</w:t>
+      </w:r>
+    </w:p>
+    <w:p>
+      <w:pPr>
+        <w:spacing w:after="200"/>
+        <w:jc w:val="center"/>
+      </w:pPr>
+      <w:r>
+        <w:rPr>
+          <w:rFonts w:ascii="Arial" w:cs="Arial" w:eastAsia="Arial" w:hAnsi="Arial"/>
+          <w:color w:val="333333"/>
+          <w:sz w:val="28"/>
+          <w:szCs w:val="28"/>
+        </w:rPr>
+        <w:t xml:space="preserve">Version 1.0.0</w:t>
       </w:r>
     </w:p>
     <w:p>
@@ -121,7 +136,7 @@
           <w:sz w:val="22"/>
           <w:szCs w:val="22"/>
         </w:rPr>
-        <w:t xml:space="preserve">The Step Noise Detection application is a Python desktop tool for analyzing baseline data from TDD files produced by Nabsys HD-Mapping instruments. It reads interleaved multi-channel voltage data (typically 256 channels at 100 Hz), detects step noise using three complementary methods, and provides interactive visualization for inspecting results.</w:t>
+        <w:t xml:space="preserve">The Step Noise Detection application is a Python desktop tool for analyzing baseline data from TDD files produced by Nabsys HD-Mapping instruments. It reads interleaved multi-channel voltage data (typically 256 channels at 100 Hz), detects step noise using four complementary methods, and provides interactive visualization for inspecting results.</w:t>
       </w:r>
     </w:p>
     <w:p>
@@ -2574,6 +2589,19 @@
     </w:p>
     <w:p>
       <w:pPr>
+        <w:spacing w:after="120"/>
+      </w:pPr>
+      <w:r>
+        <w:rPr>
+          <w:rFonts w:ascii="Arial" w:cs="Arial" w:eastAsia="Arial" w:hAnsi="Arial"/>
+          <w:sz w:val="22"/>
+          <w:szCs w:val="22"/>
+        </w:rPr>
+        <w:t xml:space="preserve">The application has seven tabs, presented in order: Metadata, Overview, Single Channel, Edge Detection, RMS Detection, Envelope, and FFT.</w:t>
+      </w:r>
+    </w:p>
+    <w:p>
+      <w:pPr>
         <w:pStyle w:val="Heading2"/>
         <w:spacing w:after="160" w:before="280"/>
       </w:pPr>
@@ -2586,7 +2614,217 @@
           <w:sz w:val="26"/>
           <w:szCs w:val="26"/>
         </w:rPr>
-        <w:t xml:space="preserve">4.1 Overview Tab</w:t>
+        <w:t xml:space="preserve">4.1 Metadata Tab</w:t>
+      </w:r>
+    </w:p>
+    <w:p>
+      <w:pPr>
+        <w:spacing w:after="120"/>
+      </w:pPr>
+      <w:r>
+        <w:rPr>
+          <w:rFonts w:ascii="Arial" w:cs="Arial" w:eastAsia="Arial" w:hAnsi="Arial"/>
+          <w:sz w:val="22"/>
+          <w:szCs w:val="22"/>
+        </w:rPr>
+        <w:t xml:space="preserve">The Metadata tab is the first tab displayed after loading a TDD file. It presents all header fields extracted from the TDD binary file in a read-only table, organized into the following sections:</w:t>
+      </w:r>
+    </w:p>
+    <w:p>
+      <w:pPr>
+        <w:pStyle w:val="ListParagraph"/>
+        <w:numPr>
+          <w:ilvl w:val="0"/>
+          <w:numId w:val="1"/>
+        </w:numPr>
+        <w:spacing w:after="60"/>
+      </w:pPr>
+      <w:r>
+        <w:rPr>
+          <w:rFonts w:ascii="Arial" w:cs="Arial" w:eastAsia="Arial" w:hAnsi="Arial"/>
+          <w:b/>
+          <w:sz w:val="22"/>
+          <w:szCs w:val="22"/>
+        </w:rPr>
+        <w:t xml:space="preserve">File</w:t>
+      </w:r>
+      <w:r>
+        <w:rPr>
+          <w:rFonts w:ascii="Arial" w:cs="Arial" w:eastAsia="Arial" w:hAnsi="Arial"/>
+          <w:sz w:val="22"/>
+          <w:szCs w:val="22"/>
+        </w:rPr>
+        <w:t xml:space="preserve"> — File path, magic number, header version, and file format identifiers.</w:t>
+      </w:r>
+    </w:p>
+    <w:p>
+      <w:pPr>
+        <w:pStyle w:val="ListParagraph"/>
+        <w:numPr>
+          <w:ilvl w:val="0"/>
+          <w:numId w:val="1"/>
+        </w:numPr>
+        <w:spacing w:after="60"/>
+      </w:pPr>
+      <w:r>
+        <w:rPr>
+          <w:rFonts w:ascii="Arial" w:cs="Arial" w:eastAsia="Arial" w:hAnsi="Arial"/>
+          <w:b/>
+          <w:sz w:val="22"/>
+          <w:szCs w:val="22"/>
+        </w:rPr>
+        <w:t xml:space="preserve">System</w:t>
+      </w:r>
+      <w:r>
+        <w:rPr>
+          <w:rFonts w:ascii="Arial" w:cs="Arial" w:eastAsia="Arial" w:hAnsi="Arial"/>
+          <w:sz w:val="22"/>
+          <w:szCs w:val="22"/>
+        </w:rPr>
+        <w:t xml:space="preserve"> — System serial number, FPGA version, and hardware configuration.</w:t>
+      </w:r>
+    </w:p>
+    <w:p>
+      <w:pPr>
+        <w:pStyle w:val="ListParagraph"/>
+        <w:numPr>
+          <w:ilvl w:val="0"/>
+          <w:numId w:val="1"/>
+        </w:numPr>
+        <w:spacing w:after="60"/>
+      </w:pPr>
+      <w:r>
+        <w:rPr>
+          <w:rFonts w:ascii="Arial" w:cs="Arial" w:eastAsia="Arial" w:hAnsi="Arial"/>
+          <w:b/>
+          <w:sz w:val="22"/>
+          <w:szCs w:val="22"/>
+        </w:rPr>
+        <w:t xml:space="preserve">Detector</w:t>
+      </w:r>
+      <w:r>
+        <w:rPr>
+          <w:rFonts w:ascii="Arial" w:cs="Arial" w:eastAsia="Arial" w:hAnsi="Arial"/>
+          <w:sz w:val="22"/>
+          <w:szCs w:val="22"/>
+        </w:rPr>
+        <w:t xml:space="preserve"> — Detector serial number, type, and channel count.</w:t>
+      </w:r>
+    </w:p>
+    <w:p>
+      <w:pPr>
+        <w:pStyle w:val="ListParagraph"/>
+        <w:numPr>
+          <w:ilvl w:val="0"/>
+          <w:numId w:val="1"/>
+        </w:numPr>
+        <w:spacing w:after="60"/>
+      </w:pPr>
+      <w:r>
+        <w:rPr>
+          <w:rFonts w:ascii="Arial" w:cs="Arial" w:eastAsia="Arial" w:hAnsi="Arial"/>
+          <w:b/>
+          <w:sz w:val="22"/>
+          <w:szCs w:val="22"/>
+        </w:rPr>
+        <w:t xml:space="preserve">Sample</w:t>
+      </w:r>
+      <w:r>
+        <w:rPr>
+          <w:rFonts w:ascii="Arial" w:cs="Arial" w:eastAsia="Arial" w:hAnsi="Arial"/>
+          <w:sz w:val="22"/>
+          <w:szCs w:val="22"/>
+        </w:rPr>
+        <w:t xml:space="preserve"> — Sample ID and related identification fields.</w:t>
+      </w:r>
+    </w:p>
+    <w:p>
+      <w:pPr>
+        <w:pStyle w:val="ListParagraph"/>
+        <w:numPr>
+          <w:ilvl w:val="0"/>
+          <w:numId w:val="1"/>
+        </w:numPr>
+        <w:spacing w:after="60"/>
+      </w:pPr>
+      <w:r>
+        <w:rPr>
+          <w:rFonts w:ascii="Arial" w:cs="Arial" w:eastAsia="Arial" w:hAnsi="Arial"/>
+          <w:b/>
+          <w:sz w:val="22"/>
+          <w:szCs w:val="22"/>
+        </w:rPr>
+        <w:t xml:space="preserve">Run</w:t>
+      </w:r>
+      <w:r>
+        <w:rPr>
+          <w:rFonts w:ascii="Arial" w:cs="Arial" w:eastAsia="Arial" w:hAnsi="Arial"/>
+          <w:sz w:val="22"/>
+          <w:szCs w:val="22"/>
+        </w:rPr>
+        <w:t xml:space="preserve"> — Run name, acquisition start/stop times, and recording parameters.</w:t>
+      </w:r>
+    </w:p>
+    <w:p>
+      <w:pPr>
+        <w:pStyle w:val="ListParagraph"/>
+        <w:numPr>
+          <w:ilvl w:val="0"/>
+          <w:numId w:val="1"/>
+        </w:numPr>
+        <w:spacing w:after="60"/>
+      </w:pPr>
+      <w:r>
+        <w:rPr>
+          <w:rFonts w:ascii="Arial" w:cs="Arial" w:eastAsia="Arial" w:hAnsi="Arial"/>
+          <w:b/>
+          <w:sz w:val="22"/>
+          <w:szCs w:val="22"/>
+        </w:rPr>
+        <w:t xml:space="preserve">Data</w:t>
+      </w:r>
+      <w:r>
+        <w:rPr>
+          <w:rFonts w:ascii="Arial" w:cs="Arial" w:eastAsia="Arial" w:hAnsi="Arial"/>
+          <w:sz w:val="22"/>
+          <w:szCs w:val="22"/>
+        </w:rPr>
+        <w:t xml:space="preserve"> — Sample rate, data format, calibration factors, and total sample count.</w:t>
+      </w:r>
+    </w:p>
+    <w:p>
+      <w:pPr>
+        <w:spacing w:after="120"/>
+      </w:pPr>
+      <w:r>
+        <w:rPr>
+          <w:rFonts w:ascii="Arial" w:cs="Arial" w:eastAsia="Arial" w:hAnsi="Arial"/>
+          <w:sz w:val="22"/>
+          <w:szCs w:val="22"/>
+        </w:rPr>
+        <w:t xml:space="preserve">This tab is populated automatically when a file is loaded and provides a quick reference for all instrument and acquisition parameters without needing to inspect the binary file directly.</w:t>
+      </w:r>
+    </w:p>
+    <w:p>
+      <w:pPr>
+        <w:spacing w:after="80"/>
+      </w:pPr>
+    </w:p>
+    <w:p>
+      <w:pPr>
+        <w:pStyle w:val="Heading2"/>
+        <w:spacing w:after="160" w:before="280"/>
+      </w:pPr>
+      <w:r>
+        <w:rPr>
+          <w:rFonts w:ascii="Arial" w:cs="Arial" w:eastAsia="Arial" w:hAnsi="Arial"/>
+          <w:b/>
+          <w:bCs/>
+          <w:color w:val="2E5090"/>
+          <w:sz w:val="26"/>
+          <w:szCs w:val="26"/>
+        </w:rPr>
+        <w:t xml:space="preserve">4.2 Overview Tab</w:t>
       </w:r>
     </w:p>
     <w:p>
@@ -2765,7 +3003,7 @@
           <w:sz w:val="26"/>
           <w:szCs w:val="26"/>
         </w:rPr>
-        <w:t xml:space="preserve">4.2 Single Channel Tab</w:t>
+        <w:t xml:space="preserve">4.3 Single Channel Tab</w:t>
       </w:r>
     </w:p>
     <w:p>
@@ -3016,7 +3254,7 @@
           <w:sz w:val="26"/>
           <w:szCs w:val="26"/>
         </w:rPr>
-        <w:t xml:space="preserve">4.3 Edge Detection Tab</w:t>
+        <w:t xml:space="preserve">4.4 Edge Detection Tab</w:t>
       </w:r>
     </w:p>
     <w:p>
@@ -3339,7 +3577,7 @@
           <w:sz w:val="26"/>
           <w:szCs w:val="26"/>
         </w:rPr>
-        <w:t xml:space="preserve">4.4 RMS Detection Tab</w:t>
+        <w:t xml:space="preserve">4.5 RMS Detection Tab</w:t>
       </w:r>
     </w:p>
     <w:p>
@@ -3626,7 +3864,162 @@
           <w:sz w:val="26"/>
           <w:szCs w:val="26"/>
         </w:rPr>
-        <w:t xml:space="preserve">4.5 FFT Tab</w:t>
+        <w:t xml:space="preserve">4.6 Envelope Tab</w:t>
+      </w:r>
+    </w:p>
+    <w:p>
+      <w:pPr>
+        <w:spacing w:after="120"/>
+      </w:pPr>
+      <w:r>
+        <w:rPr>
+          <w:rFonts w:ascii="Arial" w:cs="Arial" w:eastAsia="Arial" w:hAnsi="Arial"/>
+          <w:sz w:val="22"/>
+          <w:szCs w:val="22"/>
+        </w:rPr>
+        <w:t xml:space="preserve">The Envelope tab implements the “hug” detector ported from the MATLAB StepNoiseCalculator.m script. It provides a complementary view of step noise by analyzing how closely the signal hugs its upper and lower envelopes versus its overall mean.</w:t>
+      </w:r>
+    </w:p>
+    <w:p>
+      <w:pPr>
+        <w:spacing w:after="120"/>
+      </w:pPr>
+      <w:r>
+        <w:rPr>
+          <w:rFonts w:ascii="Arial" w:cs="Arial" w:eastAsia="Arial" w:hAnsi="Arial"/>
+          <w:sz w:val="22"/>
+          <w:szCs w:val="22"/>
+        </w:rPr>
+        <w:t xml:space="preserve">When the Envelope tab is active and a channel is selected, the application computes upper and lower signal envelopes and calculates per-sample distances. The plot displays:</w:t>
+      </w:r>
+    </w:p>
+    <w:p>
+      <w:pPr>
+        <w:pStyle w:val="ListParagraph"/>
+        <w:numPr>
+          <w:ilvl w:val="0"/>
+          <w:numId w:val="1"/>
+        </w:numPr>
+        <w:spacing w:after="60"/>
+      </w:pPr>
+      <w:r>
+        <w:rPr>
+          <w:rFonts w:ascii="Arial" w:cs="Arial" w:eastAsia="Arial" w:hAnsi="Arial"/>
+          <w:b/>
+          <w:sz w:val="22"/>
+          <w:szCs w:val="22"/>
+        </w:rPr>
+        <w:t xml:space="preserve">Raw signal</w:t>
+      </w:r>
+      <w:r>
+        <w:rPr>
+          <w:rFonts w:ascii="Arial" w:cs="Arial" w:eastAsia="Arial" w:hAnsi="Arial"/>
+          <w:sz w:val="22"/>
+          <w:szCs w:val="22"/>
+        </w:rPr>
+        <w:t xml:space="preserve"> (mV) in the background.</w:t>
+      </w:r>
+    </w:p>
+    <w:p>
+      <w:pPr>
+        <w:pStyle w:val="ListParagraph"/>
+        <w:numPr>
+          <w:ilvl w:val="0"/>
+          <w:numId w:val="1"/>
+        </w:numPr>
+        <w:spacing w:after="60"/>
+      </w:pPr>
+      <w:r>
+        <w:rPr>
+          <w:rFonts w:ascii="Arial" w:cs="Arial" w:eastAsia="Arial" w:hAnsi="Arial"/>
+          <w:b/>
+          <w:sz w:val="22"/>
+          <w:szCs w:val="22"/>
+        </w:rPr>
+        <w:t xml:space="preserve">Upper and lower envelopes</w:t>
+      </w:r>
+      <w:r>
+        <w:rPr>
+          <w:rFonts w:ascii="Arial" w:cs="Arial" w:eastAsia="Arial" w:hAnsi="Arial"/>
+          <w:sz w:val="22"/>
+          <w:szCs w:val="22"/>
+        </w:rPr>
+        <w:t xml:space="preserve"> shown as dashed lines tracing the signal’s peaks and troughs.</w:t>
+      </w:r>
+    </w:p>
+    <w:p>
+      <w:pPr>
+        <w:pStyle w:val="ListParagraph"/>
+        <w:numPr>
+          <w:ilvl w:val="0"/>
+          <w:numId w:val="1"/>
+        </w:numPr>
+        <w:spacing w:after="60"/>
+      </w:pPr>
+      <w:r>
+        <w:rPr>
+          <w:rFonts w:ascii="Arial" w:cs="Arial" w:eastAsia="Arial" w:hAnsi="Arial"/>
+          <w:b/>
+          <w:sz w:val="22"/>
+          <w:szCs w:val="22"/>
+        </w:rPr>
+        <w:t xml:space="preserve">Signal mean</w:t>
+      </w:r>
+      <w:r>
+        <w:rPr>
+          <w:rFonts w:ascii="Arial" w:cs="Arial" w:eastAsia="Arial" w:hAnsi="Arial"/>
+          <w:sz w:val="22"/>
+          <w:szCs w:val="22"/>
+        </w:rPr>
+        <w:t xml:space="preserve"> shown as a horizontal line.</w:t>
+      </w:r>
+    </w:p>
+    <w:p>
+      <w:pPr>
+        <w:spacing w:after="120"/>
+      </w:pPr>
+      <w:r>
+        <w:rPr>
+          <w:rFonts w:ascii="Arial" w:cs="Arial" w:eastAsia="Arial" w:hAnsi="Arial"/>
+          <w:sz w:val="22"/>
+          <w:szCs w:val="22"/>
+        </w:rPr>
+        <w:t xml:space="preserve">The plot title reports the key metric: the hug/mid ratio. A ratio less than 1.0 indicates step noise (the data clusters near the envelopes rather than the center). The closer the ratio is to zero, the stronger the bimodal step-noise pattern.</w:t>
+      </w:r>
+    </w:p>
+    <w:p>
+      <w:pPr>
+        <w:spacing w:after="120"/>
+      </w:pPr>
+      <w:r>
+        <w:rPr>
+          <w:rFonts w:ascii="Arial" w:cs="Arial" w:eastAsia="Arial" w:hAnsi="Arial"/>
+          <w:sz w:val="22"/>
+          <w:szCs w:val="22"/>
+        </w:rPr>
+        <w:t xml:space="preserve">The peak separation parameter (default 50 samples) controls the smoothness of the envelopes. Higher values produce smoother envelopes; lower values track rapid fluctuations more closely. The analysis automatically re-runs when the active channel changes.</w:t>
+      </w:r>
+    </w:p>
+    <w:p>
+      <w:pPr>
+        <w:spacing w:after="80"/>
+      </w:pPr>
+    </w:p>
+    <w:p>
+      <w:pPr>
+        <w:pStyle w:val="Heading2"/>
+        <w:spacing w:after="160" w:before="280"/>
+      </w:pPr>
+      <w:r>
+        <w:rPr>
+          <w:rFonts w:ascii="Arial" w:cs="Arial" w:eastAsia="Arial" w:hAnsi="Arial"/>
+          <w:b/>
+          <w:bCs/>
+          <w:color w:val="2E5090"/>
+          <w:sz w:val="26"/>
+          <w:szCs w:val="26"/>
+        </w:rPr>
+        <w:t xml:space="preserve">4.7 FFT Tab</w:t>
       </w:r>
     </w:p>
     <w:p>
@@ -5913,6 +6306,271 @@
       </w:r>
     </w:p>
     <w:p>
+      <w:pPr>
+        <w:spacing w:after="80"/>
+      </w:pPr>
+    </w:p>
+    <w:p>
+      <w:pPr>
+        <w:pStyle w:val="Heading2"/>
+        <w:spacing w:after="160" w:before="280"/>
+      </w:pPr>
+      <w:r>
+        <w:rPr>
+          <w:rFonts w:ascii="Arial" w:cs="Arial" w:eastAsia="Arial" w:hAnsi="Arial"/>
+          <w:b/>
+          <w:bCs/>
+          <w:color w:val="2E5090"/>
+          <w:sz w:val="26"/>
+          <w:szCs w:val="26"/>
+        </w:rPr>
+        <w:t xml:space="preserve">5.4 Envelope / Hug Detection</w:t>
+      </w:r>
+    </w:p>
+    <w:p>
+      <w:pPr>
+        <w:spacing w:after="120"/>
+      </w:pPr>
+      <w:r>
+        <w:rPr>
+          <w:rFonts w:ascii="Arial" w:cs="Arial" w:eastAsia="Arial" w:hAnsi="Arial"/>
+          <w:sz w:val="22"/>
+          <w:szCs w:val="22"/>
+        </w:rPr>
+        <w:t xml:space="preserve">The envelope/hug detector is ported from the MATLAB StepNoiseCalculator.m script. It provides a statistical measure of whether the signal exhibits bimodal (step-like) behavior by comparing how closely data points cluster near the signal’s envelopes versus its overall mean.</w:t>
+      </w:r>
+    </w:p>
+    <w:p>
+      <w:pPr>
+        <w:spacing w:after="120"/>
+      </w:pPr>
+      <w:r>
+        <w:rPr>
+          <w:rFonts w:ascii="Arial" w:cs="Arial" w:eastAsia="Arial" w:hAnsi="Arial"/>
+          <w:b/>
+          <w:sz w:val="22"/>
+          <w:szCs w:val="22"/>
+        </w:rPr>
+        <w:t xml:space="preserve">Algorithm steps:</w:t>
+      </w:r>
+    </w:p>
+    <w:p>
+      <w:pPr>
+        <w:pStyle w:val="ListParagraph"/>
+        <w:numPr>
+          <w:ilvl w:val="0"/>
+          <w:numId w:val="3"/>
+        </w:numPr>
+        <w:spacing w:after="60"/>
+      </w:pPr>
+      <w:r>
+        <w:rPr>
+          <w:rFonts w:ascii="Arial" w:cs="Arial" w:eastAsia="Arial" w:hAnsi="Arial"/>
+          <w:b/>
+          <w:sz w:val="22"/>
+          <w:szCs w:val="22"/>
+        </w:rPr>
+        <w:t xml:space="preserve">Compute envelopes.</w:t>
+      </w:r>
+      <w:r>
+        <w:rPr>
+          <w:rFonts w:ascii="Arial" w:cs="Arial" w:eastAsia="Arial" w:hAnsi="Arial"/>
+          <w:sz w:val="22"/>
+          <w:szCs w:val="22"/>
+        </w:rPr>
+        <w:t xml:space="preserve"> Find local peaks (for the upper envelope) and local troughs (for the lower envelope) using scipy.signal.find_peaks with a minimum peak separation parameter (default 50 samples). Interpolate between these peak/trough positions to produce smooth, full-length envelope curves.</w:t>
+      </w:r>
+    </w:p>
+    <w:p>
+      <w:pPr>
+        <w:pStyle w:val="ListParagraph"/>
+        <w:numPr>
+          <w:ilvl w:val="0"/>
+          <w:numId w:val="3"/>
+        </w:numPr>
+        <w:spacing w:after="60"/>
+      </w:pPr>
+      <w:r>
+        <w:rPr>
+          <w:rFonts w:ascii="Arial" w:cs="Arial" w:eastAsia="Arial" w:hAnsi="Arial"/>
+          <w:b/>
+          <w:sz w:val="22"/>
+          <w:szCs w:val="22"/>
+        </w:rPr>
+        <w:t xml:space="preserve">Compute “hug” distance.</w:t>
+      </w:r>
+      <w:r>
+        <w:rPr>
+          <w:rFonts w:ascii="Arial" w:cs="Arial" w:eastAsia="Arial" w:hAnsi="Arial"/>
+          <w:sz w:val="22"/>
+          <w:szCs w:val="22"/>
+        </w:rPr>
+        <w:t xml:space="preserve"> For each sample, compute the absolute distance to both the upper and lower envelopes, then take the minimum. This “hug” value measures how close each data point is to its nearest envelope.</w:t>
+      </w:r>
+    </w:p>
+    <w:p>
+      <w:pPr>
+        <w:pStyle w:val="ListParagraph"/>
+        <w:numPr>
+          <w:ilvl w:val="0"/>
+          <w:numId w:val="3"/>
+        </w:numPr>
+        <w:spacing w:after="60"/>
+      </w:pPr>
+      <w:r>
+        <w:rPr>
+          <w:rFonts w:ascii="Arial" w:cs="Arial" w:eastAsia="Arial" w:hAnsi="Arial"/>
+          <w:b/>
+          <w:sz w:val="22"/>
+          <w:szCs w:val="22"/>
+        </w:rPr>
+        <w:t xml:space="preserve">Compute “mid” distance.</w:t>
+      </w:r>
+      <w:r>
+        <w:rPr>
+          <w:rFonts w:ascii="Arial" w:cs="Arial" w:eastAsia="Arial" w:hAnsi="Arial"/>
+          <w:sz w:val="22"/>
+          <w:szCs w:val="22"/>
+        </w:rPr>
+        <w:t xml:space="preserve"> For each sample, compute the absolute distance to the overall signal mean.</w:t>
+      </w:r>
+    </w:p>
+    <w:p>
+      <w:pPr>
+        <w:pStyle w:val="ListParagraph"/>
+        <w:numPr>
+          <w:ilvl w:val="0"/>
+          <w:numId w:val="3"/>
+        </w:numPr>
+        <w:spacing w:after="60"/>
+      </w:pPr>
+      <w:r>
+        <w:rPr>
+          <w:rFonts w:ascii="Arial" w:cs="Arial" w:eastAsia="Arial" w:hAnsi="Arial"/>
+          <w:b/>
+          <w:sz w:val="22"/>
+          <w:szCs w:val="22"/>
+        </w:rPr>
+        <w:t xml:space="preserve">Compute ratio.</w:t>
+      </w:r>
+      <w:r>
+        <w:rPr>
+          <w:rFonts w:ascii="Arial" w:cs="Arial" w:eastAsia="Arial" w:hAnsi="Arial"/>
+          <w:sz w:val="22"/>
+          <w:szCs w:val="22"/>
+        </w:rPr>
+        <w:t xml:space="preserve"> ratio = mean(hug) / mean(mid). This single scalar summarizes the result.</w:t>
+      </w:r>
+    </w:p>
+    <w:p>
+      <w:pPr>
+        <w:spacing w:after="120"/>
+      </w:pPr>
+      <w:r>
+        <w:rPr>
+          <w:rFonts w:ascii="Arial" w:cs="Arial" w:eastAsia="Arial" w:hAnsi="Arial"/>
+          <w:b/>
+          <w:sz w:val="22"/>
+          <w:szCs w:val="22"/>
+        </w:rPr>
+        <w:t xml:space="preserve">Interpretation:</w:t>
+      </w:r>
+    </w:p>
+    <w:p>
+      <w:pPr>
+        <w:pStyle w:val="ListParagraph"/>
+        <w:numPr>
+          <w:ilvl w:val="0"/>
+          <w:numId w:val="1"/>
+        </w:numPr>
+        <w:spacing w:after="60"/>
+      </w:pPr>
+      <w:r>
+        <w:rPr>
+          <w:rFonts w:ascii="Arial" w:cs="Arial" w:eastAsia="Arial" w:hAnsi="Arial"/>
+          <w:b/>
+          <w:sz w:val="22"/>
+          <w:szCs w:val="22"/>
+        </w:rPr>
+        <w:t xml:space="preserve">Ratio &lt; 1.0</w:t>
+      </w:r>
+      <w:r>
+        <w:rPr>
+          <w:rFonts w:ascii="Arial" w:cs="Arial" w:eastAsia="Arial" w:hAnsi="Arial"/>
+          <w:sz w:val="22"/>
+          <w:szCs w:val="22"/>
+        </w:rPr>
+        <w:t xml:space="preserve"> — The signal clusters near its envelopes (bimodal distribution). This indicates step noise, where the signal spends most of its time near the “high” or “low” level rather than near the center.</w:t>
+      </w:r>
+    </w:p>
+    <w:p>
+      <w:pPr>
+        <w:pStyle w:val="ListParagraph"/>
+        <w:numPr>
+          <w:ilvl w:val="0"/>
+          <w:numId w:val="1"/>
+        </w:numPr>
+        <w:spacing w:after="60"/>
+      </w:pPr>
+      <w:r>
+        <w:rPr>
+          <w:rFonts w:ascii="Arial" w:cs="Arial" w:eastAsia="Arial" w:hAnsi="Arial"/>
+          <w:b/>
+          <w:sz w:val="22"/>
+          <w:szCs w:val="22"/>
+        </w:rPr>
+        <w:t xml:space="preserve">Ratio ≈ 1.0</w:t>
+      </w:r>
+      <w:r>
+        <w:rPr>
+          <w:rFonts w:ascii="Arial" w:cs="Arial" w:eastAsia="Arial" w:hAnsi="Arial"/>
+          <w:sz w:val="22"/>
+          <w:szCs w:val="22"/>
+        </w:rPr>
+        <w:t xml:space="preserve"> — The signal is roughly uniformly distributed between the envelopes and the mean. No strong step noise pattern.</w:t>
+      </w:r>
+    </w:p>
+    <w:p>
+      <w:pPr>
+        <w:pStyle w:val="ListParagraph"/>
+        <w:numPr>
+          <w:ilvl w:val="0"/>
+          <w:numId w:val="1"/>
+        </w:numPr>
+        <w:spacing w:after="60"/>
+      </w:pPr>
+      <w:r>
+        <w:rPr>
+          <w:rFonts w:ascii="Arial" w:cs="Arial" w:eastAsia="Arial" w:hAnsi="Arial"/>
+          <w:b/>
+          <w:sz w:val="22"/>
+          <w:szCs w:val="22"/>
+        </w:rPr>
+        <w:t xml:space="preserve">Ratio &gt; 1.0</w:t>
+      </w:r>
+      <w:r>
+        <w:rPr>
+          <w:rFonts w:ascii="Arial" w:cs="Arial" w:eastAsia="Arial" w:hAnsi="Arial"/>
+          <w:sz w:val="22"/>
+          <w:szCs w:val="22"/>
+        </w:rPr>
+        <w:t xml:space="preserve"> — The signal clusters near the mean (Gaussian-like noise). This is the expected behavior for a clean baseline.</w:t>
+      </w:r>
+    </w:p>
+    <w:p>
+      <w:pPr>
+        <w:spacing w:after="120"/>
+      </w:pPr>
+      <w:r>
+        <w:rPr>
+          <w:rFonts w:ascii="Arial" w:cs="Arial" w:eastAsia="Arial" w:hAnsi="Arial"/>
+          <w:sz w:val="22"/>
+          <w:szCs w:val="22"/>
+        </w:rPr>
+        <w:t xml:space="preserve">The envelope method is particularly useful for detecting step noise that the edge detector might miss — for example, when step transitions are gradual or when the signal has many small, closely spaced steps that don’t individually exceed the edge amplitude threshold but collectively produce a bimodal distribution.</w:t>
+      </w:r>
+    </w:p>
+    <w:p>
       <w:r>
         <w:br w:type="page"/>
       </w:r>
@@ -6132,7 +6790,7 @@
           <w:sz w:val="22"/>
           <w:szCs w:val="22"/>
         </w:rPr>
-        <w:t xml:space="preserve">Open a TDD file</w:t>
+        <w:t xml:space="preserve">Open a TDD file and review the Metadata tab for acquisition parameters</w:t>
       </w:r>
     </w:p>
     <w:p>
@@ -6241,6 +6899,24 @@
           <w:szCs w:val="22"/>
         </w:rPr>
         <w:t xml:space="preserve">Switch to the RMS Detection tab for a statistical summary of noisy time regions — click segments in the table to zoom in</w:t>
+      </w:r>
+    </w:p>
+    <w:p>
+      <w:pPr>
+        <w:pStyle w:val="ListParagraph"/>
+        <w:numPr>
+          <w:ilvl w:val="0"/>
+          <w:numId w:val="3"/>
+        </w:numPr>
+        <w:spacing w:after="60"/>
+      </w:pPr>
+      <w:r>
+        <w:rPr>
+          <w:rFonts w:ascii="Arial" w:cs="Arial" w:eastAsia="Arial" w:hAnsi="Arial"/>
+          <w:sz w:val="22"/>
+          <w:szCs w:val="22"/>
+        </w:rPr>
+        <w:t xml:space="preserve">Check the Envelope tab — a hug/mid ratio below 1.0 confirms bimodal step-noise behavior</w:t>
       </w:r>
     </w:p>
     <w:p>

</xml_diff>